<commit_message>
Dwarven Paladin no longer has additional save changes, fixes Fighter crit boon
</commit_message>
<xml_diff>
--- a/Character Templates/MS-Word/Dwarf/Dwarf Paladin Template.docx
+++ b/Character Templates/MS-Word/Dwarf/Dwarf Paladin Template.docx
@@ -26,15 +26,7 @@
           <w:sz w:val="44"/>
           <w:szCs w:val="44"/>
         </w:rPr>
-        <w:t>wa</w:t>
-      </w:r>
-      <w:r>
-        <w:rPr>
-          <w:rFonts w:ascii="FlutedGermanica" w:hAnsi="FlutedGermanica"/>
-          <w:sz w:val="44"/>
-          <w:szCs w:val="44"/>
-        </w:rPr>
-        <w:t>r</w:t>
+        <w:t>war</w:t>
       </w:r>
       <w:r>
         <w:rPr>
@@ -42,15 +34,7 @@
           <w:sz w:val="48"/>
           <w:szCs w:val="48"/>
         </w:rPr>
-        <w:t>f</w:t>
-      </w:r>
-      <w:r>
-        <w:rPr>
-          <w:rFonts w:ascii="FlutedGermanica" w:hAnsi="FlutedGermanica"/>
-          <w:sz w:val="48"/>
-          <w:szCs w:val="48"/>
-        </w:rPr>
-        <w:t xml:space="preserve"> </w:t>
+        <w:t xml:space="preserve">f </w:t>
       </w:r>
       <w:r>
         <w:rPr>
@@ -146,15 +130,7 @@
       </w:r>
       <w:r>
         <w:rPr/>
-        <w:t xml:space="preserve"> :________________________</w:t>
-      </w:r>
-      <w:r>
-        <w:rPr/>
-        <w:t>_____</w:t>
-      </w:r>
-      <w:r>
-        <w:rPr/>
-        <w:t xml:space="preserve">    </w:t>
+        <w:t xml:space="preserve"> :_____________________________    </w:t>
       </w:r>
       <w:r>
         <w:rPr>
@@ -208,25 +184,7 @@
           <w:sz w:val="21"/>
           <w:szCs w:val="21"/>
         </w:rPr>
-        <w:t>(initial 2d6</w:t>
-      </w:r>
-      <w:r>
-        <w:rPr>
-          <w:i/>
-          <w:iCs/>
-          <w:sz w:val="21"/>
-          <w:szCs w:val="21"/>
-        </w:rPr>
-        <w:t>+3</w:t>
-      </w:r>
-      <w:r>
-        <w:rPr>
-          <w:i/>
-          <w:iCs/>
-          <w:sz w:val="21"/>
-          <w:szCs w:val="21"/>
-        </w:rPr>
-        <w:t>, +1d6/level)</w:t>
+        <w:t>(initial 2d6+3, +1d6/level)</w:t>
       </w:r>
     </w:p>
     <w:p>
@@ -262,23 +220,7 @@
       </w:r>
       <w:r>
         <w:rPr/>
-        <w:t>: __________</w:t>
-      </w:r>
-      <w:r>
-        <w:rPr/>
-        <w:t>___________________</w:t>
-      </w:r>
-      <w:r>
-        <w:rPr/>
-        <w:t>____</w:t>
-      </w:r>
-      <w:r>
-        <w:rPr/>
-        <w:t>_</w:t>
-      </w:r>
-      <w:r>
-        <w:rPr/>
-        <w:t xml:space="preserve">   </w:t>
+        <w:t xml:space="preserve">: __________________________________   </w:t>
       </w:r>
       <w:r>
         <w:rPr>
@@ -289,31 +231,7 @@
       </w:r>
       <w:r>
         <w:rPr/>
-        <w:t>:___</w:t>
-      </w:r>
-      <w:r>
-        <w:rPr/>
-        <w:t>__</w:t>
-      </w:r>
-      <w:r>
-        <w:rPr/>
-        <w:t>_/_</w:t>
-      </w:r>
-      <w:r>
-        <w:rPr/>
-        <w:t>__</w:t>
-      </w:r>
-      <w:r>
-        <w:rPr/>
-        <w:t>_</w:t>
-      </w:r>
-      <w:r>
-        <w:rPr/>
-        <w:t>__</w:t>
-      </w:r>
-      <w:r>
-        <w:rPr/>
-        <w:t xml:space="preserve">  </w:t>
+        <w:t xml:space="preserve">:______/______  </w:t>
       </w:r>
       <w:r>
         <w:rPr>
@@ -324,19 +242,7 @@
       </w:r>
       <w:r>
         <w:rPr/>
-        <w:t>:__</w:t>
-      </w:r>
-      <w:r>
-        <w:rPr/>
-        <w:t>__</w:t>
-      </w:r>
-      <w:r>
-        <w:rPr/>
-        <w:t>__/_____</w:t>
-      </w:r>
-      <w:r>
-        <w:rPr/>
-        <w:t>__</w:t>
+        <w:t>:______/_______</w:t>
       </w:r>
     </w:p>
     <w:p>
@@ -361,97 +267,7 @@
         <w:tab/>
         <w:tab/>
         <w:tab/>
-        <w:t>(</w:t>
-      </w:r>
-      <w:r>
-        <w:rPr>
-          <w:i/>
-          <w:iCs/>
-          <w:sz w:val="21"/>
-          <w:szCs w:val="21"/>
-        </w:rPr>
-        <w:t>base/</w:t>
-      </w:r>
-      <w:r>
-        <w:rPr>
-          <w:i/>
-          <w:iCs/>
-          <w:sz w:val="21"/>
-          <w:szCs w:val="21"/>
-        </w:rPr>
-        <w:t xml:space="preserve">vs </w:t>
-      </w:r>
-      <w:r>
-        <w:rPr>
-          <w:i/>
-          <w:iCs/>
-          <w:sz w:val="21"/>
-          <w:szCs w:val="21"/>
-        </w:rPr>
-        <w:t>evil</w:t>
-      </w:r>
-      <w:r>
-        <w:rPr>
-          <w:i/>
-          <w:iCs/>
-          <w:sz w:val="21"/>
-          <w:szCs w:val="21"/>
-        </w:rPr>
-        <w:t>&amp;undead</w:t>
-      </w:r>
-      <w:r>
-        <w:rPr>
-          <w:i/>
-          <w:iCs/>
-          <w:sz w:val="21"/>
-          <w:szCs w:val="21"/>
-        </w:rPr>
-        <w:t>)         (</w:t>
-      </w:r>
-      <w:r>
-        <w:rPr>
-          <w:i/>
-          <w:iCs/>
-          <w:sz w:val="21"/>
-          <w:szCs w:val="21"/>
-        </w:rPr>
-        <w:t>base/</w:t>
-      </w:r>
-      <w:r>
-        <w:rPr>
-          <w:i/>
-          <w:iCs/>
-          <w:sz w:val="21"/>
-          <w:szCs w:val="21"/>
-        </w:rPr>
-        <w:t xml:space="preserve">vs </w:t>
-      </w:r>
-      <w:r>
-        <w:rPr>
-          <w:i/>
-          <w:iCs/>
-          <w:sz w:val="21"/>
-          <w:szCs w:val="21"/>
-        </w:rPr>
-        <w:t>evil</w:t>
-      </w:r>
-      <w:r>
-        <w:rPr>
-          <w:i/>
-          <w:iCs/>
-          <w:sz w:val="21"/>
-          <w:szCs w:val="21"/>
-        </w:rPr>
-        <w:t>&amp;undead</w:t>
-      </w:r>
-      <w:r>
-        <w:rPr>
-          <w:i/>
-          <w:iCs/>
-          <w:sz w:val="21"/>
-          <w:szCs w:val="21"/>
-        </w:rPr>
-        <w:t xml:space="preserve">) </w:t>
+        <w:t xml:space="preserve">(base/vs evil&amp;undead)         (base/vs evil&amp;undead) </w:t>
       </w:r>
     </w:p>
     <w:p>
@@ -592,21 +408,7 @@
           <w:sz w:val="24"/>
           <w:szCs w:val="24"/>
         </w:rPr>
-        <w:t xml:space="preserve"> to </w:t>
-      </w:r>
-      <w:r>
-        <w:rPr>
-          <w:sz w:val="24"/>
-          <w:szCs w:val="24"/>
-        </w:rPr>
-        <w:t>D</w:t>
-      </w:r>
-      <w:r>
-        <w:rPr>
-          <w:sz w:val="24"/>
-          <w:szCs w:val="24"/>
-        </w:rPr>
-        <w:t xml:space="preserve">amage (this benefit does not apply to ranged combat). A </w:t>
+        <w:t xml:space="preserve"> to Damage (this benefit does not apply to ranged combat). A </w:t>
       </w:r>
       <w:r>
         <w:rPr>
@@ -670,21 +472,7 @@
           <w:sz w:val="24"/>
           <w:szCs w:val="24"/>
         </w:rPr>
-        <w:t xml:space="preserve"> to save rolls against evil &amp; undead. </w:t>
-      </w:r>
-      <w:r>
-        <w:rPr>
-          <w:sz w:val="24"/>
-          <w:szCs w:val="24"/>
-        </w:rPr>
-        <w:t>A</w:t>
-      </w:r>
-      <w:r>
-        <w:rPr>
-          <w:sz w:val="24"/>
-          <w:szCs w:val="24"/>
-        </w:rPr>
-        <w:t xml:space="preserve">dditionally they also grant the party </w:t>
+        <w:t xml:space="preserve"> to save rolls against evil &amp; undead. Additionally they also grant the party </w:t>
       </w:r>
       <w:r>
         <w:rPr>
@@ -716,7 +504,7 @@
           <w:sz w:val="24"/>
           <w:szCs w:val="24"/>
         </w:rPr>
-        <w:t xml:space="preserve"> can absorb half of the damage inflicted to a party member from a trap or event, and once per battle from an enemy. </w:t>
+        <w:t xml:space="preserve"> can absorb half of the damage inflicted to a party member from a trap or event, and once per battle from an enemy. When a Paladin is equipped with a single or two handed weapon, it can channel divine favor by means of prayer. This can be granted to them </w:t>
       </w:r>
       <w:r>
         <w:rPr>
@@ -725,104 +513,6 @@
           <w:sz w:val="24"/>
           <w:szCs w:val="24"/>
         </w:rPr>
-        <w:t>Paladins</w:t>
-      </w:r>
-      <w:r>
-        <w:rPr>
-          <w:sz w:val="24"/>
-          <w:szCs w:val="24"/>
-        </w:rPr>
-        <w:t xml:space="preserve"> training grants them extraordinary resilience, however this comes at the cost of a modicum of dexterity. They have a </w:t>
-      </w:r>
-      <w:r>
-        <w:rPr>
-          <w:i/>
-          <w:iCs/>
-          <w:sz w:val="24"/>
-          <w:szCs w:val="24"/>
-        </w:rPr>
-        <w:t>+1</w:t>
-      </w:r>
-      <w:r>
-        <w:rPr>
-          <w:sz w:val="24"/>
-          <w:szCs w:val="24"/>
-        </w:rPr>
-        <w:t xml:space="preserve"> penalty to </w:t>
-      </w:r>
-      <w:r>
-        <w:rPr>
-          <w:i/>
-          <w:iCs/>
-          <w:sz w:val="24"/>
-          <w:szCs w:val="24"/>
-        </w:rPr>
-        <w:t xml:space="preserve">dex saves </w:t>
-      </w:r>
-      <w:r>
-        <w:rPr>
-          <w:i w:val="false"/>
-          <w:iCs w:val="false"/>
-          <w:sz w:val="24"/>
-          <w:szCs w:val="24"/>
-        </w:rPr>
-        <w:t>and</w:t>
-      </w:r>
-      <w:r>
-        <w:rPr>
-          <w:i/>
-          <w:iCs/>
-          <w:sz w:val="24"/>
-          <w:szCs w:val="24"/>
-        </w:rPr>
-        <w:t xml:space="preserve"> -1 </w:t>
-      </w:r>
-      <w:r>
-        <w:rPr>
-          <w:i w:val="false"/>
-          <w:iCs w:val="false"/>
-          <w:sz w:val="24"/>
-          <w:szCs w:val="24"/>
-        </w:rPr>
-        <w:t>boon to</w:t>
-      </w:r>
-      <w:r>
-        <w:rPr>
-          <w:i/>
-          <w:iCs/>
-          <w:sz w:val="24"/>
-          <w:szCs w:val="24"/>
-        </w:rPr>
-        <w:t xml:space="preserve"> body saves</w:t>
-      </w:r>
-      <w:r>
-        <w:rPr>
-          <w:sz w:val="24"/>
-          <w:szCs w:val="24"/>
-        </w:rPr>
-        <w:t xml:space="preserve"> (accounted for). When a Paladin is equipped with a single or two handed weapon, it can channel divine favor by means of prayer. </w:t>
-      </w:r>
-      <w:r>
-        <w:rPr>
-          <w:sz w:val="24"/>
-          <w:szCs w:val="24"/>
-        </w:rPr>
-        <w:t>This can be granted to them</w:t>
-      </w:r>
-      <w:r>
-        <w:rPr>
-          <w:sz w:val="24"/>
-          <w:szCs w:val="24"/>
-        </w:rPr>
-        <w:t xml:space="preserve"> </w:t>
-      </w:r>
-      <w:r>
-        <w:rPr>
-          <w:i/>
-          <w:iCs/>
-          <w:sz w:val="24"/>
-          <w:szCs w:val="24"/>
-        </w:rPr>
         <w:t>character_level</w:t>
       </w:r>
       <w:r>
@@ -830,21 +520,7 @@
           <w:sz w:val="24"/>
           <w:szCs w:val="24"/>
         </w:rPr>
-        <w:t xml:space="preserve"> times, recover</w:t>
-      </w:r>
-      <w:r>
-        <w:rPr>
-          <w:sz w:val="24"/>
-          <w:szCs w:val="24"/>
-        </w:rPr>
-        <w:t>ing</w:t>
-      </w:r>
-      <w:r>
-        <w:rPr>
-          <w:sz w:val="24"/>
-          <w:szCs w:val="24"/>
-        </w:rPr>
-        <w:t xml:space="preserve"> one per rest and all upon leaving the Dungeon.</w:t>
+        <w:t xml:space="preserve"> times, recovering one per rest and all upon leaving the Dungeon.</w:t>
       </w:r>
     </w:p>
     <w:p>
@@ -856,10 +532,7 @@
         </w:rPr>
       </w:pPr>
       <w:r>
-        <w:rPr>
-          <w:sz w:val="24"/>
-          <w:szCs w:val="24"/>
-        </w:rPr>
+        <w:rPr/>
       </w:r>
     </w:p>
     <w:p>
@@ -884,35 +557,7 @@
           <w:sz w:val="24"/>
           <w:szCs w:val="24"/>
         </w:rPr>
-        <w:t xml:space="preserve"> are at a </w:t>
-      </w:r>
-      <w:r>
-        <w:rPr>
-          <w:sz w:val="24"/>
-          <w:szCs w:val="24"/>
-        </w:rPr>
-        <w:t xml:space="preserve">considerable </w:t>
-      </w:r>
-      <w:r>
-        <w:rPr>
-          <w:sz w:val="24"/>
-          <w:szCs w:val="24"/>
-        </w:rPr>
-        <w:t xml:space="preserve">disadvantage when facing divine </w:t>
-      </w:r>
-      <w:r>
-        <w:rPr>
-          <w:sz w:val="24"/>
-          <w:szCs w:val="24"/>
-        </w:rPr>
-        <w:t xml:space="preserve">or holy </w:t>
-      </w:r>
-      <w:r>
-        <w:rPr>
-          <w:sz w:val="24"/>
-          <w:szCs w:val="24"/>
-        </w:rPr>
-        <w:t xml:space="preserve">opponents, all their collective boons against undead and evil gain a negative value. Additionally, miss chance is based on rolls against </w:t>
+        <w:t xml:space="preserve"> are at a considerable disadvantage when facing divine or holy opponents, all their collective boons against undead and evil gain a negative value. Additionally, miss chance is based on rolls against </w:t>
       </w:r>
       <w:r>
         <w:rPr>
@@ -944,63 +589,7 @@
           <w:sz w:val="24"/>
           <w:szCs w:val="24"/>
         </w:rPr>
-        <w:t xml:space="preserve">. If their boons make their total AC negative, they will incur AC damage each round. </w:t>
-      </w:r>
-      <w:r>
-        <w:rPr>
-          <w:sz w:val="24"/>
-          <w:szCs w:val="24"/>
-        </w:rPr>
-        <w:t xml:space="preserve">Also, their strictness gets in the way of diplomatic relations: </w:t>
-      </w:r>
-      <w:r>
-        <w:rPr>
-          <w:sz w:val="24"/>
-          <w:szCs w:val="24"/>
-        </w:rPr>
-        <w:t xml:space="preserve">They will attack undead on the spot, </w:t>
-      </w:r>
-      <w:r>
-        <w:rPr>
-          <w:sz w:val="24"/>
-          <w:szCs w:val="24"/>
-        </w:rPr>
-        <w:t>so</w:t>
-      </w:r>
-      <w:r>
-        <w:rPr>
-          <w:sz w:val="24"/>
-          <w:szCs w:val="24"/>
-        </w:rPr>
-        <w:t xml:space="preserve"> any friendly undead will steer clear of your party. They will also provide no quarter to fiends </w:t>
-      </w:r>
-      <w:r>
-        <w:rPr>
-          <w:sz w:val="24"/>
-          <w:szCs w:val="24"/>
-        </w:rPr>
-        <w:t>and</w:t>
-      </w:r>
-      <w:r>
-        <w:rPr>
-          <w:sz w:val="24"/>
-          <w:szCs w:val="24"/>
-        </w:rPr>
-        <w:t xml:space="preserve"> will attempt to slay them </w:t>
-      </w:r>
-      <w:r>
-        <w:rPr>
-          <w:sz w:val="24"/>
-          <w:szCs w:val="24"/>
-        </w:rPr>
-        <w:t>even if captured</w:t>
-      </w:r>
-      <w:r>
-        <w:rPr>
-          <w:sz w:val="24"/>
-          <w:szCs w:val="24"/>
-        </w:rPr>
-        <w:t xml:space="preserve">. Additionally, </w:t>
+        <w:t xml:space="preserve">. If their boons make their total AC negative, they will incur AC damage each round. Also, their strictness gets in the way of diplomatic relations: They will attack undead on the spot, so any friendly undead will steer clear of your party. They will also provide no quarter to fiends and will attempt to slay them even if captured. Additionally, </w:t>
       </w:r>
       <w:r>
         <w:rPr>
@@ -1016,70 +605,7 @@
           <w:sz w:val="24"/>
           <w:szCs w:val="24"/>
         </w:rPr>
-        <w:t xml:space="preserve"> shun bribery choosing to intimidate instead </w:t>
-      </w:r>
-      <w:r>
-        <w:rPr>
-          <w:sz w:val="24"/>
-          <w:szCs w:val="24"/>
-        </w:rPr>
-        <w:t>which</w:t>
-      </w:r>
-      <w:r>
-        <w:rPr>
-          <w:sz w:val="24"/>
-          <w:szCs w:val="24"/>
-        </w:rPr>
-        <w:t xml:space="preserve"> makes it hard for them to relate with certain monsters. Orcs </w:t>
-      </w:r>
-      <w:r>
-        <w:rPr>
-          <w:sz w:val="24"/>
-          <w:szCs w:val="24"/>
-        </w:rPr>
-        <w:t>and Goblins</w:t>
-      </w:r>
-      <w:r>
-        <w:rPr>
-          <w:sz w:val="24"/>
-          <w:szCs w:val="24"/>
-        </w:rPr>
-        <w:t xml:space="preserve"> will </w:t>
-      </w:r>
-      <w:r>
-        <w:rPr>
-          <w:sz w:val="24"/>
-          <w:szCs w:val="24"/>
-        </w:rPr>
-        <w:t>be hostile to a</w:t>
-      </w:r>
-      <w:r>
-        <w:rPr>
-          <w:sz w:val="24"/>
-          <w:szCs w:val="24"/>
-        </w:rPr>
-        <w:t xml:space="preserve"> party on a</w:t>
-      </w:r>
-      <w:r>
-        <w:rPr>
-          <w:sz w:val="24"/>
-          <w:szCs w:val="24"/>
-        </w:rPr>
-        <w:t>ny</w:t>
-      </w:r>
-      <w:r>
-        <w:rPr>
-          <w:sz w:val="24"/>
-          <w:szCs w:val="24"/>
-        </w:rPr>
-        <w:t xml:space="preserve"> roll </w:t>
-      </w:r>
-      <w:r>
-        <w:rPr>
-          <w:sz w:val="24"/>
-          <w:szCs w:val="24"/>
-        </w:rPr>
-        <w:t xml:space="preserve">other than </w:t>
+        <w:t xml:space="preserve"> shun bribery choosing to intimidate instead which makes it hard for them to relate with certain monsters. Orcs and Goblins will be hostile to a party on any roll other than </w:t>
       </w:r>
       <w:r>
         <w:rPr>
@@ -1111,35 +637,7 @@
           <w:sz w:val="24"/>
           <w:szCs w:val="24"/>
         </w:rPr>
-        <w:t xml:space="preserve"> does the talking, they will neither provide clues nor assistance. Goblins </w:t>
-      </w:r>
-      <w:r>
-        <w:rPr>
-          <w:sz w:val="24"/>
-          <w:szCs w:val="24"/>
-        </w:rPr>
-        <w:t>however are</w:t>
-      </w:r>
-      <w:r>
-        <w:rPr>
-          <w:sz w:val="24"/>
-          <w:szCs w:val="24"/>
-        </w:rPr>
-        <w:t xml:space="preserve"> cowardly </w:t>
-      </w:r>
-      <w:r>
-        <w:rPr>
-          <w:sz w:val="24"/>
-          <w:szCs w:val="24"/>
-        </w:rPr>
-        <w:t>and</w:t>
-      </w:r>
-      <w:r>
-        <w:rPr>
-          <w:sz w:val="24"/>
-          <w:szCs w:val="24"/>
-        </w:rPr>
-        <w:t xml:space="preserve"> can be subdued into revealing clues. </w:t>
+        <w:t xml:space="preserve"> does the talking, they will neither provide clues nor assistance. Goblins however are cowardly and can be subdued into revealing clues. </w:t>
       </w:r>
     </w:p>
     <w:p>
@@ -1173,25 +671,7 @@
           <w:sz w:val="24"/>
           <w:szCs w:val="24"/>
         </w:rPr>
-        <w:t>Dw</w:t>
-      </w:r>
-      <w:r>
-        <w:rPr>
-          <w:b/>
-          <w:bCs/>
-          <w:sz w:val="24"/>
-          <w:szCs w:val="24"/>
-        </w:rPr>
-        <w:t>a</w:t>
-      </w:r>
-      <w:r>
-        <w:rPr>
-          <w:b/>
-          <w:bCs/>
-          <w:sz w:val="24"/>
-          <w:szCs w:val="24"/>
-        </w:rPr>
-        <w:t>rf</w:t>
+        <w:t>Dwarf</w:t>
       </w:r>
       <w:r>
         <w:rPr>
@@ -1230,6 +710,7 @@
     <w:p>
       <w:pPr>
         <w:pStyle w:val="Normal"/>
+        <w:spacing w:before="0" w:after="0"/>
         <w:jc w:val="both"/>
         <w:rPr>
           <w:sz w:val="24"/>
@@ -1257,8 +738,8 @@
         </w:tblCellMar>
       </w:tblPr>
       <w:tblGrid>
-        <w:gridCol w:w="1975"/>
-        <w:gridCol w:w="2250"/>
+        <w:gridCol w:w="1974"/>
+        <w:gridCol w:w="2251"/>
         <w:gridCol w:w="1900"/>
       </w:tblGrid>
       <w:tr>
@@ -1296,7 +777,7 @@
         <w:trPr/>
         <w:tc>
           <w:tcPr>
-            <w:tcW w:w="1975" w:type="dxa"/>
+            <w:tcW w:w="1974" w:type="dxa"/>
             <w:tcBorders/>
           </w:tcPr>
           <w:p>
@@ -1329,13 +810,13 @@
                 <w:sz w:val="22"/>
                 <w:szCs w:val="22"/>
               </w:rPr>
-              <w:t>2</w:t>
-            </w:r>
-          </w:p>
-        </w:tc>
-        <w:tc>
-          <w:tcPr>
-            <w:tcW w:w="2250" w:type="dxa"/>
+              <w:t>3</w:t>
+            </w:r>
+          </w:p>
+        </w:tc>
+        <w:tc>
+          <w:tcPr>
+            <w:tcW w:w="2251" w:type="dxa"/>
             <w:tcBorders/>
           </w:tcPr>
           <w:p>
@@ -1354,8 +835,38 @@
                 <w:sz w:val="22"/>
                 <w:szCs w:val="22"/>
               </w:rPr>
-              <w:t>De</w:t>
-            </w:r>
+              <w:t>Dex</w:t>
+            </w:r>
+            <w:r>
+              <w:rPr>
+                <w:sz w:val="22"/>
+                <w:szCs w:val="22"/>
+              </w:rPr>
+              <w:t xml:space="preserve">: </w:t>
+            </w:r>
+            <w:r>
+              <w:rPr>
+                <w:sz w:val="22"/>
+                <w:szCs w:val="22"/>
+              </w:rPr>
+              <w:t>5</w:t>
+            </w:r>
+          </w:p>
+        </w:tc>
+        <w:tc>
+          <w:tcPr>
+            <w:tcW w:w="1900" w:type="dxa"/>
+            <w:tcBorders/>
+          </w:tcPr>
+          <w:p>
+            <w:pPr>
+              <w:pStyle w:val="TableContents"/>
+              <w:jc w:val="center"/>
+              <w:rPr>
+                <w:sz w:val="22"/>
+                <w:szCs w:val="22"/>
+              </w:rPr>
+            </w:pPr>
             <w:r>
               <w:rPr>
                 <w:i/>
@@ -1363,45 +874,6 @@
                 <w:sz w:val="22"/>
                 <w:szCs w:val="22"/>
               </w:rPr>
-              <w:t>x</w:t>
-            </w:r>
-            <w:r>
-              <w:rPr>
-                <w:sz w:val="22"/>
-                <w:szCs w:val="22"/>
-              </w:rPr>
-              <w:t xml:space="preserve">: </w:t>
-            </w:r>
-            <w:r>
-              <w:rPr>
-                <w:sz w:val="22"/>
-                <w:szCs w:val="22"/>
-              </w:rPr>
-              <w:t>6</w:t>
-            </w:r>
-          </w:p>
-        </w:tc>
-        <w:tc>
-          <w:tcPr>
-            <w:tcW w:w="1900" w:type="dxa"/>
-            <w:tcBorders/>
-          </w:tcPr>
-          <w:p>
-            <w:pPr>
-              <w:pStyle w:val="TableContents"/>
-              <w:jc w:val="center"/>
-              <w:rPr>
-                <w:sz w:val="22"/>
-                <w:szCs w:val="22"/>
-              </w:rPr>
-            </w:pPr>
-            <w:r>
-              <w:rPr>
-                <w:i/>
-                <w:iCs/>
-                <w:sz w:val="22"/>
-                <w:szCs w:val="22"/>
-              </w:rPr>
               <w:t>Magic</w:t>
             </w:r>
             <w:r>
@@ -1409,14 +881,7 @@
                 <w:sz w:val="22"/>
                 <w:szCs w:val="22"/>
               </w:rPr>
-              <w:t xml:space="preserve">: </w:t>
-            </w:r>
-            <w:r>
-              <w:rPr>
-                <w:sz w:val="22"/>
-                <w:szCs w:val="22"/>
-              </w:rPr>
-              <w:t>4</w:t>
+              <w:t>: 4</w:t>
             </w:r>
           </w:p>
         </w:tc>
@@ -1452,18 +917,7 @@
                 <w:sz w:val="22"/>
                 <w:szCs w:val="22"/>
               </w:rPr>
-              <w:t xml:space="preserve">Saves </w:t>
-            </w:r>
-            <w:r>
-              <w:rPr>
-                <w:b/>
-                <w:bCs/>
-                <w:i/>
-                <w:iCs/>
-                <w:sz w:val="22"/>
-                <w:szCs w:val="22"/>
-              </w:rPr>
-              <w:t>vs Evil &amp; Undead</w:t>
+              <w:t>Saves vs Evil &amp; Undead</w:t>
             </w:r>
           </w:p>
         </w:tc>
@@ -1472,7 +926,7 @@
         <w:trPr/>
         <w:tc>
           <w:tcPr>
-            <w:tcW w:w="1975" w:type="dxa"/>
+            <w:tcW w:w="1974" w:type="dxa"/>
             <w:tcBorders/>
           </w:tcPr>
           <w:p>
@@ -1496,7 +950,7 @@
                 <w:sz w:val="22"/>
                 <w:szCs w:val="22"/>
               </w:rPr>
-              <w:t>2</w:t>
+              <w:t>3</w:t>
             </w:r>
             <w:r>
               <w:rPr>
@@ -1509,7 +963,7 @@
         </w:tc>
         <w:tc>
           <w:tcPr>
-            <w:tcW w:w="2250" w:type="dxa"/>
+            <w:tcW w:w="2251" w:type="dxa"/>
             <w:tcBorders/>
           </w:tcPr>
           <w:p>
@@ -1533,7 +987,7 @@
                 <w:sz w:val="22"/>
                 <w:szCs w:val="22"/>
               </w:rPr>
-              <w:t>6</w:t>
+              <w:t>5</w:t>
             </w:r>
             <w:r>
               <w:rPr>
@@ -1563,21 +1017,7 @@
                 <w:sz w:val="22"/>
                 <w:szCs w:val="22"/>
               </w:rPr>
-              <w:t xml:space="preserve">Magic: </w:t>
-            </w:r>
-            <w:r>
-              <w:rPr>
-                <w:sz w:val="22"/>
-                <w:szCs w:val="22"/>
-              </w:rPr>
-              <w:t>4</w:t>
-            </w:r>
-            <w:r>
-              <w:rPr>
-                <w:sz w:val="22"/>
-                <w:szCs w:val="22"/>
-              </w:rPr>
-              <w:t xml:space="preserve"> -</w:t>
+              <w:t>Magic: 4 -</w:t>
             </w:r>
           </w:p>
         </w:tc>
@@ -1599,25 +1039,7 @@
           <w:sz w:val="21"/>
           <w:szCs w:val="21"/>
         </w:rPr>
-        <w:t>Roll against the value above</w:t>
-      </w:r>
-      <w:r>
-        <w:rPr>
-          <w:i/>
-          <w:iCs/>
-          <w:sz w:val="21"/>
-          <w:szCs w:val="21"/>
-        </w:rPr>
-        <w:t xml:space="preserve">. </w:t>
-      </w:r>
-      <w:r>
-        <w:rPr>
-          <w:i/>
-          <w:iCs/>
-          <w:sz w:val="21"/>
-          <w:szCs w:val="21"/>
-        </w:rPr>
-        <w:t>Should you find something that alters your saves then modify accordingly.</w:t>
+        <w:t>Roll against the value above. Should you find something that alters your saves then modify accordingly.</w:t>
       </w:r>
     </w:p>
     <w:p>
@@ -1663,112 +1085,7 @@
           <w:sz w:val="22"/>
           <w:szCs w:val="22"/>
         </w:rPr>
-        <w:t>A</w:t>
-      </w:r>
-      <w:r>
-        <w:rPr>
-          <w:sz w:val="22"/>
-          <w:szCs w:val="22"/>
-        </w:rPr>
-        <w:t>n</w:t>
-      </w:r>
-      <w:r>
-        <w:rPr>
-          <w:sz w:val="22"/>
-          <w:szCs w:val="22"/>
-        </w:rPr>
-        <w:t xml:space="preserve"> </w:t>
-      </w:r>
-      <w:r>
-        <w:rPr>
-          <w:sz w:val="22"/>
-          <w:szCs w:val="22"/>
-        </w:rPr>
-        <w:t>Dwarven</w:t>
-      </w:r>
-      <w:r>
-        <w:rPr>
-          <w:sz w:val="22"/>
-          <w:szCs w:val="22"/>
-        </w:rPr>
-        <w:t xml:space="preserve"> </w:t>
-      </w:r>
-      <w:r>
-        <w:rPr>
-          <w:sz w:val="22"/>
-          <w:szCs w:val="22"/>
-        </w:rPr>
-        <w:t>Paladin</w:t>
-      </w:r>
-      <w:r>
-        <w:rPr>
-          <w:sz w:val="22"/>
-          <w:szCs w:val="22"/>
-        </w:rPr>
-        <w:t xml:space="preserve"> is a</w:t>
-      </w:r>
-      <w:r>
-        <w:rPr>
-          <w:sz w:val="22"/>
-          <w:szCs w:val="22"/>
-        </w:rPr>
-        <w:t xml:space="preserve">ble to use </w:t>
-      </w:r>
-      <w:r>
-        <w:rPr>
-          <w:sz w:val="22"/>
-          <w:szCs w:val="22"/>
-        </w:rPr>
-        <w:t xml:space="preserve">any </w:t>
-      </w:r>
-      <w:r>
-        <w:rPr>
-          <w:sz w:val="22"/>
-          <w:szCs w:val="22"/>
-        </w:rPr>
-        <w:t xml:space="preserve">weapons &amp; </w:t>
-      </w:r>
-      <w:r>
-        <w:rPr>
-          <w:sz w:val="22"/>
-          <w:szCs w:val="22"/>
-        </w:rPr>
-        <w:t xml:space="preserve">all </w:t>
-      </w:r>
-      <w:r>
-        <w:rPr>
-          <w:sz w:val="22"/>
-          <w:szCs w:val="22"/>
-        </w:rPr>
-        <w:t xml:space="preserve">armor </w:t>
-      </w:r>
-      <w:r>
-        <w:rPr>
-          <w:sz w:val="22"/>
-          <w:szCs w:val="22"/>
-        </w:rPr>
-        <w:t xml:space="preserve">it </w:t>
-      </w:r>
-      <w:r>
-        <w:rPr>
-          <w:sz w:val="22"/>
-          <w:szCs w:val="22"/>
-        </w:rPr>
-        <w:t>encounters</w:t>
-      </w:r>
-      <w:r>
-        <w:rPr>
-          <w:sz w:val="22"/>
-          <w:szCs w:val="22"/>
-        </w:rPr>
-        <w:t xml:space="preserve">. However, unless they are equipped with a helmet, plate armor and wield either a single or two handed weapon, not all abilities will be available to them. </w:t>
-      </w:r>
-      <w:r>
-        <w:rPr>
-          <w:sz w:val="22"/>
-          <w:szCs w:val="22"/>
-        </w:rPr>
-        <w:t>Keep in mind Dwarfs already have poor dexterity, therefore Paladin training is not recommended for them.</w:t>
+        <w:t>An Dwarven Paladin is able to use any weapons &amp; all armor it encounters. However, unless they are equipped with a helmet, plate armor and wield either a single or two handed weapon, not all abilities will be available to them. Keep in mind Dwarfs already have poor dexterity, therefore Paladin training is not recommended for them.</w:t>
       </w:r>
     </w:p>
     <w:p>
@@ -1800,11 +1117,7 @@
       </w:r>
       <w:r>
         <w:rPr/>
-        <w:t xml:space="preserve">: </w:t>
-      </w:r>
-      <w:r>
-        <w:rPr/>
-        <w:t xml:space="preserve">_________________ </w:t>
+        <w:t xml:space="preserve">: _________________ </w:t>
       </w:r>
       <w:r>
         <w:rPr>
@@ -1826,11 +1139,7 @@
       </w:r>
       <w:r>
         <w:rPr/>
-        <w:t>: __________________</w:t>
-      </w:r>
-      <w:r>
-        <w:rPr/>
-        <w:t>_</w:t>
+        <w:t>: ___________________</w:t>
       </w:r>
     </w:p>
     <w:p>
@@ -1847,11 +1156,7 @@
       </w:r>
       <w:r>
         <w:rPr/>
-        <w:t>: __________________  _____: __________________ _____: __________________</w:t>
-      </w:r>
-      <w:r>
-        <w:rPr/>
-        <w:t>__</w:t>
+        <w:t>: __________________  _____: __________________ _____: ____________________</w:t>
       </w:r>
     </w:p>
     <w:p>
@@ -3512,43 +2817,7 @@
           <w:sz w:val="21"/>
           <w:szCs w:val="21"/>
         </w:rPr>
-        <w:t xml:space="preserve">* You start </w:t>
-      </w:r>
-      <w:r>
-        <w:rPr>
-          <w:i/>
-          <w:iCs/>
-          <w:sz w:val="21"/>
-          <w:szCs w:val="21"/>
-        </w:rPr>
-        <w:t xml:space="preserve">the game </w:t>
-      </w:r>
-      <w:r>
-        <w:rPr>
-          <w:i/>
-          <w:iCs/>
-          <w:sz w:val="21"/>
-          <w:szCs w:val="21"/>
-        </w:rPr>
-        <w:t xml:space="preserve">with 5 torches &amp; 5 rations, </w:t>
-      </w:r>
-      <w:r>
-        <w:rPr>
-          <w:i/>
-          <w:iCs/>
-          <w:sz w:val="21"/>
-          <w:szCs w:val="21"/>
-        </w:rPr>
-        <w:t>set aside a slot for torches and another for rations</w:t>
-      </w:r>
-      <w:r>
-        <w:rPr>
-          <w:i/>
-          <w:iCs/>
-          <w:sz w:val="21"/>
-          <w:szCs w:val="21"/>
-        </w:rPr>
-        <w:t>.</w:t>
+        <w:t>* You start the game with 5 torches &amp; 5 rations, set aside a slot for torches and another for rations.</w:t>
       </w:r>
     </w:p>
     <w:p>
@@ -3582,6 +2851,7 @@
     <w:p>
       <w:pPr>
         <w:pStyle w:val="Normal"/>
+        <w:spacing w:before="0" w:after="0"/>
         <w:jc w:val="center"/>
         <w:rPr>
           <w:i w:val="false"/>
@@ -3600,18 +2870,7 @@
           <w:sz w:val="28"/>
           <w:szCs w:val="28"/>
         </w:rPr>
-        <w:t>Paladin Divine Favor</w:t>
-      </w:r>
-      <w:r>
-        <w:rPr>
-          <w:b/>
-          <w:bCs/>
-          <w:i w:val="false"/>
-          <w:iCs w:val="false"/>
-          <w:sz w:val="28"/>
-          <w:szCs w:val="28"/>
-        </w:rPr>
-        <w:t xml:space="preserve"> List</w:t>
+        <w:t>Paladin Divine Favor List</w:t>
       </w:r>
     </w:p>
     <w:tbl>
@@ -3628,15 +2887,15 @@
         </w:tblCellMar>
       </w:tblPr>
       <w:tblGrid>
-        <w:gridCol w:w="1494"/>
-        <w:gridCol w:w="2962"/>
+        <w:gridCol w:w="1493"/>
+        <w:gridCol w:w="2963"/>
         <w:gridCol w:w="5516"/>
       </w:tblGrid>
       <w:tr>
         <w:trPr/>
         <w:tc>
           <w:tcPr>
-            <w:tcW w:w="1494" w:type="dxa"/>
+            <w:tcW w:w="1493" w:type="dxa"/>
             <w:tcBorders>
               <w:top w:val="single" w:sz="4" w:space="0" w:color="000000"/>
               <w:start w:val="single" w:sz="4" w:space="0" w:color="000000"/>
@@ -3663,7 +2922,7 @@
         </w:tc>
         <w:tc>
           <w:tcPr>
-            <w:tcW w:w="2962" w:type="dxa"/>
+            <w:tcW w:w="2963" w:type="dxa"/>
             <w:tcBorders>
               <w:top w:val="single" w:sz="4" w:space="0" w:color="000000"/>
               <w:start w:val="single" w:sz="4" w:space="0" w:color="000000"/>
@@ -3721,7 +2980,7 @@
         <w:trPr/>
         <w:tc>
           <w:tcPr>
-            <w:tcW w:w="1494" w:type="dxa"/>
+            <w:tcW w:w="1493" w:type="dxa"/>
             <w:tcBorders>
               <w:start w:val="single" w:sz="4" w:space="0" w:color="000000"/>
               <w:bottom w:val="single" w:sz="4" w:space="0" w:color="000000"/>
@@ -3746,7 +3005,7 @@
         </w:tc>
         <w:tc>
           <w:tcPr>
-            <w:tcW w:w="2962" w:type="dxa"/>
+            <w:tcW w:w="2963" w:type="dxa"/>
             <w:tcBorders>
               <w:start w:val="single" w:sz="4" w:space="0" w:color="000000"/>
               <w:bottom w:val="single" w:sz="4" w:space="0" w:color="000000"/>
@@ -3809,63 +3068,7 @@
                 <w:sz w:val="22"/>
                 <w:szCs w:val="22"/>
               </w:rPr>
-              <w:t xml:space="preserve">to a fellow party member's saving throw. This boon can be applied </w:t>
-            </w:r>
-            <w:r>
-              <w:rPr>
-                <w:sz w:val="22"/>
-                <w:szCs w:val="22"/>
-              </w:rPr>
-              <w:t>out of</w:t>
-            </w:r>
-            <w:r>
-              <w:rPr>
-                <w:sz w:val="22"/>
-                <w:szCs w:val="22"/>
-              </w:rPr>
-              <w:t xml:space="preserve"> turn, but it </w:t>
-            </w:r>
-            <w:r>
-              <w:rPr>
-                <w:sz w:val="22"/>
-                <w:szCs w:val="22"/>
-              </w:rPr>
-              <w:t>must</w:t>
-            </w:r>
-            <w:r>
-              <w:rPr>
-                <w:sz w:val="22"/>
-                <w:szCs w:val="22"/>
-              </w:rPr>
-              <w:t xml:space="preserve"> be applied before rolling dice; otherwise it's too late and </w:t>
-            </w:r>
-            <w:r>
-              <w:rPr>
-                <w:sz w:val="22"/>
-                <w:szCs w:val="22"/>
-              </w:rPr>
-              <w:t>the prayer</w:t>
-            </w:r>
-            <w:r>
-              <w:rPr>
-                <w:sz w:val="22"/>
-                <w:szCs w:val="22"/>
-              </w:rPr>
-              <w:t xml:space="preserve"> has no effect </w:t>
-            </w:r>
-            <w:r>
-              <w:rPr>
-                <w:sz w:val="22"/>
-                <w:szCs w:val="22"/>
-              </w:rPr>
-              <w:t>on the outcome</w:t>
-            </w:r>
-            <w:r>
-              <w:rPr>
-                <w:sz w:val="22"/>
-                <w:szCs w:val="22"/>
-              </w:rPr>
-              <w:t>.</w:t>
+              <w:t>to a fellow party member's saving throw. This boon can be applied out of turn, but it must be applied before rolling dice; otherwise it's too late and the prayer has no effect on the outcome.</w:t>
             </w:r>
           </w:p>
         </w:tc>
@@ -3874,7 +3077,7 @@
         <w:trPr/>
         <w:tc>
           <w:tcPr>
-            <w:tcW w:w="1494" w:type="dxa"/>
+            <w:tcW w:w="1493" w:type="dxa"/>
             <w:tcBorders>
               <w:start w:val="single" w:sz="4" w:space="0" w:color="000000"/>
               <w:bottom w:val="single" w:sz="4" w:space="0" w:color="000000"/>
@@ -3899,7 +3102,7 @@
         </w:tc>
         <w:tc>
           <w:tcPr>
-            <w:tcW w:w="2962" w:type="dxa"/>
+            <w:tcW w:w="2963" w:type="dxa"/>
             <w:tcBorders>
               <w:start w:val="single" w:sz="4" w:space="0" w:color="000000"/>
               <w:bottom w:val="single" w:sz="4" w:space="0" w:color="000000"/>
@@ -3955,7 +3158,7 @@
         <w:trPr/>
         <w:tc>
           <w:tcPr>
-            <w:tcW w:w="1494" w:type="dxa"/>
+            <w:tcW w:w="1493" w:type="dxa"/>
             <w:tcBorders>
               <w:start w:val="single" w:sz="4" w:space="0" w:color="000000"/>
               <w:bottom w:val="single" w:sz="4" w:space="0" w:color="000000"/>
@@ -3980,7 +3183,7 @@
         </w:tc>
         <w:tc>
           <w:tcPr>
-            <w:tcW w:w="2962" w:type="dxa"/>
+            <w:tcW w:w="2963" w:type="dxa"/>
             <w:tcBorders>
               <w:start w:val="single" w:sz="4" w:space="0" w:color="000000"/>
               <w:bottom w:val="single" w:sz="4" w:space="0" w:color="000000"/>
@@ -4027,21 +3230,7 @@
                 <w:sz w:val="22"/>
                 <w:szCs w:val="22"/>
               </w:rPr>
-              <w:t xml:space="preserve">A Paladin </w:t>
-            </w:r>
-            <w:r>
-              <w:rPr>
-                <w:sz w:val="22"/>
-                <w:szCs w:val="22"/>
-              </w:rPr>
-              <w:t xml:space="preserve">must </w:t>
-            </w:r>
-            <w:r>
-              <w:rPr>
-                <w:sz w:val="22"/>
-                <w:szCs w:val="22"/>
-              </w:rPr>
-              <w:t xml:space="preserve">roll one </w:t>
+              <w:t xml:space="preserve">A Paladin must roll one </w:t>
             </w:r>
             <w:r>
               <w:rPr>
@@ -4073,21 +3262,7 @@
                 <w:sz w:val="22"/>
                 <w:szCs w:val="22"/>
               </w:rPr>
-              <w:t xml:space="preserve"> a character is cleared of poison or disease (</w:t>
-            </w:r>
-            <w:r>
-              <w:rPr>
-                <w:sz w:val="22"/>
-                <w:szCs w:val="22"/>
-              </w:rPr>
-              <w:t xml:space="preserve">either but </w:t>
-            </w:r>
-            <w:r>
-              <w:rPr>
-                <w:sz w:val="22"/>
-                <w:szCs w:val="22"/>
-              </w:rPr>
-              <w:t xml:space="preserve">just one). </w:t>
+              <w:t xml:space="preserve"> a character is cleared of poison or disease (either but just one). </w:t>
             </w:r>
             <w:r>
               <w:rPr>
@@ -4114,7 +3289,7 @@
         </w:trPr>
         <w:tc>
           <w:tcPr>
-            <w:tcW w:w="1494" w:type="dxa"/>
+            <w:tcW w:w="1493" w:type="dxa"/>
             <w:tcBorders>
               <w:start w:val="single" w:sz="4" w:space="0" w:color="000000"/>
               <w:bottom w:val="single" w:sz="4" w:space="0" w:color="000000"/>
@@ -4139,7 +3314,7 @@
         </w:tc>
         <w:tc>
           <w:tcPr>
-            <w:tcW w:w="2962" w:type="dxa"/>
+            <w:tcW w:w="2963" w:type="dxa"/>
             <w:tcBorders>
               <w:start w:val="single" w:sz="4" w:space="0" w:color="000000"/>
               <w:bottom w:val="single" w:sz="4" w:space="0" w:color="000000"/>
@@ -4229,7 +3404,7 @@
         </w:trPr>
         <w:tc>
           <w:tcPr>
-            <w:tcW w:w="1494" w:type="dxa"/>
+            <w:tcW w:w="1493" w:type="dxa"/>
             <w:tcBorders>
               <w:start w:val="single" w:sz="4" w:space="0" w:color="000000"/>
               <w:bottom w:val="single" w:sz="4" w:space="0" w:color="000000"/>
@@ -4254,7 +3429,7 @@
         </w:tc>
         <w:tc>
           <w:tcPr>
-            <w:tcW w:w="2962" w:type="dxa"/>
+            <w:tcW w:w="2963" w:type="dxa"/>
             <w:tcBorders>
               <w:start w:val="single" w:sz="4" w:space="0" w:color="000000"/>
               <w:bottom w:val="single" w:sz="4" w:space="0" w:color="000000"/>
@@ -4360,7 +3535,7 @@
         </w:trPr>
         <w:tc>
           <w:tcPr>
-            <w:tcW w:w="1494" w:type="dxa"/>
+            <w:tcW w:w="1493" w:type="dxa"/>
             <w:tcBorders>
               <w:start w:val="single" w:sz="4" w:space="0" w:color="000000"/>
               <w:bottom w:val="single" w:sz="4" w:space="0" w:color="000000"/>
@@ -4385,7 +3560,7 @@
         </w:tc>
         <w:tc>
           <w:tcPr>
-            <w:tcW w:w="2962" w:type="dxa"/>
+            <w:tcW w:w="2963" w:type="dxa"/>
             <w:tcBorders>
               <w:start w:val="single" w:sz="4" w:space="0" w:color="000000"/>
               <w:bottom w:val="single" w:sz="4" w:space="0" w:color="000000"/>
@@ -4464,21 +3639,7 @@
                 <w:sz w:val="22"/>
                 <w:szCs w:val="22"/>
               </w:rPr>
-              <w:t xml:space="preserve"> </w:t>
-            </w:r>
-            <w:r>
-              <w:rPr>
-                <w:sz w:val="22"/>
-                <w:szCs w:val="22"/>
-              </w:rPr>
-              <w:t>D</w:t>
-            </w:r>
-            <w:r>
-              <w:rPr>
-                <w:sz w:val="22"/>
-                <w:szCs w:val="22"/>
-              </w:rPr>
-              <w:t>amage.</w:t>
+              <w:t xml:space="preserve"> Damage.</w:t>
             </w:r>
           </w:p>
         </w:tc>
@@ -4560,11 +3721,11 @@
       </w:tblPr>
       <w:tblGrid>
         <w:gridCol w:w="1661"/>
+        <w:gridCol w:w="1661"/>
+        <w:gridCol w:w="1663"/>
         <w:gridCol w:w="1662"/>
         <w:gridCol w:w="1662"/>
         <w:gridCol w:w="1662"/>
-        <w:gridCol w:w="1662"/>
-        <w:gridCol w:w="1663"/>
       </w:tblGrid>
       <w:tr>
         <w:trPr/>
@@ -4587,6 +3748,40 @@
         </w:tc>
         <w:tc>
           <w:tcPr>
+            <w:tcW w:w="1661" w:type="dxa"/>
+            <w:tcBorders/>
+          </w:tcPr>
+          <w:p>
+            <w:pPr>
+              <w:pStyle w:val="TableContents"/>
+              <w:jc w:val="center"/>
+              <w:rPr/>
+            </w:pPr>
+            <w:r>
+              <w:rPr/>
+              <w:t>Level 2</w:t>
+            </w:r>
+          </w:p>
+        </w:tc>
+        <w:tc>
+          <w:tcPr>
+            <w:tcW w:w="1663" w:type="dxa"/>
+            <w:tcBorders/>
+          </w:tcPr>
+          <w:p>
+            <w:pPr>
+              <w:pStyle w:val="TableContents"/>
+              <w:jc w:val="center"/>
+              <w:rPr/>
+            </w:pPr>
+            <w:r>
+              <w:rPr/>
+              <w:t>Level 3</w:t>
+            </w:r>
+          </w:p>
+        </w:tc>
+        <w:tc>
+          <w:tcPr>
             <w:tcW w:w="1662" w:type="dxa"/>
             <w:tcBorders/>
           </w:tcPr>
@@ -4598,11 +3793,7 @@
             </w:pPr>
             <w:r>
               <w:rPr/>
-              <w:t xml:space="preserve">Level </w:t>
-            </w:r>
-            <w:r>
-              <w:rPr/>
-              <w:t>2</w:t>
+              <w:t>Level 4</w:t>
             </w:r>
           </w:p>
         </w:tc>
@@ -4619,11 +3810,7 @@
             </w:pPr>
             <w:r>
               <w:rPr/>
-              <w:t xml:space="preserve">Level </w:t>
-            </w:r>
-            <w:r>
-              <w:rPr/>
-              <w:t>3</w:t>
+              <w:t>Level 5</w:t>
             </w:r>
           </w:p>
         </w:tc>
@@ -4640,53 +3827,7 @@
             </w:pPr>
             <w:r>
               <w:rPr/>
-              <w:t xml:space="preserve">Level </w:t>
-            </w:r>
-            <w:r>
-              <w:rPr/>
-              <w:t>4</w:t>
-            </w:r>
-          </w:p>
-        </w:tc>
-        <w:tc>
-          <w:tcPr>
-            <w:tcW w:w="1662" w:type="dxa"/>
-            <w:tcBorders/>
-          </w:tcPr>
-          <w:p>
-            <w:pPr>
-              <w:pStyle w:val="TableContents"/>
-              <w:jc w:val="center"/>
-              <w:rPr/>
-            </w:pPr>
-            <w:r>
-              <w:rPr/>
-              <w:t xml:space="preserve">Level </w:t>
-            </w:r>
-            <w:r>
-              <w:rPr/>
-              <w:t>5</w:t>
-            </w:r>
-          </w:p>
-        </w:tc>
-        <w:tc>
-          <w:tcPr>
-            <w:tcW w:w="1663" w:type="dxa"/>
-            <w:tcBorders/>
-          </w:tcPr>
-          <w:p>
-            <w:pPr>
-              <w:pStyle w:val="TableContents"/>
-              <w:jc w:val="center"/>
-              <w:rPr/>
-            </w:pPr>
-            <w:r>
-              <w:rPr/>
-              <w:t xml:space="preserve">Level </w:t>
-            </w:r>
-            <w:r>
-              <w:rPr/>
-              <w:t>6</w:t>
+              <w:t>Level 6</w:t>
             </w:r>
           </w:p>
         </w:tc>
@@ -4707,52 +3848,40 @@
           <w:i/>
           <w:iCs/>
         </w:rPr>
-        <w:t xml:space="preserve">This table shows </w:t>
-      </w:r>
-      <w:r>
-        <w:rPr>
-          <w:i/>
-          <w:iCs/>
-        </w:rPr>
-        <w:t>the divine favor</w:t>
-      </w:r>
-      <w:r>
-        <w:rPr>
-          <w:i/>
-          <w:iCs/>
-        </w:rPr>
-        <w:t xml:space="preserve"> available per level, it’s meant to help keep track of spent </w:t>
-      </w:r>
-      <w:r>
-        <w:rPr>
-          <w:i/>
-          <w:iCs/>
-        </w:rPr>
-        <w:t>favor</w:t>
-      </w:r>
-      <w:r>
-        <w:rPr>
-          <w:i/>
-          <w:iCs/>
-        </w:rPr>
-        <w:t>.</w:t>
+        <w:t>This table shows the divine favor available per level, it’s meant to help keep track of spent favor.</w:t>
       </w:r>
     </w:p>
     <w:sectPr>
-      <w:footerReference w:type="default" r:id="rId2"/>
+      <w:footerReference w:type="even" r:id="rId2"/>
+      <w:footerReference w:type="default" r:id="rId3"/>
+      <w:footerReference w:type="first" r:id="rId4"/>
       <w:type w:val="nextPage"/>
       <w:pgSz w:w="12240" w:h="15840"/>
       <w:pgMar w:left="1134" w:right="1134" w:gutter="0" w:header="0" w:top="1134" w:footer="850" w:bottom="1805"/>
       <w:pgNumType w:fmt="decimal"/>
       <w:formProt w:val="false"/>
       <w:textDirection w:val="lrTb"/>
-      <w:docGrid w:type="default" w:linePitch="312" w:charSpace="4294961151"/>
+      <w:docGrid w:type="default" w:linePitch="312" w:charSpace="0"/>
     </w:sectPr>
   </w:body>
 </w:document>
 </file>
 
 <file path=word/footer1.xml><?xml version="1.0" encoding="utf-8"?>
+<w:ftr xmlns:o="urn:schemas-microsoft-com:office:office" xmlns:r="http://schemas.openxmlformats.org/officeDocument/2006/relationships" xmlns:v="urn:schemas-microsoft-com:vml" xmlns:w="http://schemas.openxmlformats.org/wordprocessingml/2006/main" xmlns:w10="urn:schemas-microsoft-com:office:word" xmlns:wp="http://schemas.openxmlformats.org/drawingml/2006/wordprocessingDrawing" xmlns:pic="http://schemas.openxmlformats.org/drawingml/2006/picture" xmlns:wps="http://schemas.microsoft.com/office/word/2010/wordprocessingShape" xmlns:wpg="http://schemas.microsoft.com/office/word/2010/wordprocessingGroup" xmlns:mc="http://schemas.openxmlformats.org/markup-compatibility/2006" xmlns:wp14="http://schemas.microsoft.com/office/word/2010/wordprocessingDrawing" xmlns:w14="http://schemas.microsoft.com/office/word/2010/wordml" xmlns:w15="http://schemas.microsoft.com/office/word/2012/wordml" mc:Ignorable="w14 wp14 w15">
+  <w:p>
+    <w:pPr>
+      <w:pStyle w:val="Footer"/>
+      <w:rPr/>
+    </w:pPr>
+    <w:r>
+      <w:rPr/>
+    </w:r>
+  </w:p>
+</w:ftr>
+</file>
+
+<file path=word/footer2.xml><?xml version="1.0" encoding="utf-8"?>
 <w:ftr xmlns:o="urn:schemas-microsoft-com:office:office" xmlns:r="http://schemas.openxmlformats.org/officeDocument/2006/relationships" xmlns:v="urn:schemas-microsoft-com:vml" xmlns:w="http://schemas.openxmlformats.org/wordprocessingml/2006/main" xmlns:w10="urn:schemas-microsoft-com:office:word" xmlns:wp="http://schemas.openxmlformats.org/drawingml/2006/wordprocessingDrawing" xmlns:pic="http://schemas.openxmlformats.org/drawingml/2006/picture" xmlns:wps="http://schemas.microsoft.com/office/word/2010/wordprocessingShape" xmlns:wpg="http://schemas.microsoft.com/office/word/2010/wordprocessingGroup" xmlns:mc="http://schemas.openxmlformats.org/markup-compatibility/2006" xmlns:wp14="http://schemas.microsoft.com/office/word/2010/wordprocessingDrawing" xmlns:w14="http://schemas.microsoft.com/office/word/2010/wordml" xmlns:w15="http://schemas.microsoft.com/office/word/2012/wordml" mc:Ignorable="w14 wp14 w15">
   <w:p>
     <w:pPr>
@@ -4783,21 +3912,7 @@
         <w:i/>
         <w:iCs/>
       </w:rPr>
-      <w:t xml:space="preserve"> </w:t>
-    </w:r>
-    <w:r>
-      <w:rPr>
-        <w:i/>
-        <w:iCs/>
-      </w:rPr>
-      <w:t>a</w:t>
-    </w:r>
-    <w:r>
-      <w:rPr>
-        <w:i/>
-        <w:iCs/>
-      </w:rPr>
-      <w:t xml:space="preserve"> </w:t>
+      <w:t xml:space="preserve"> a </w:t>
     </w:r>
     <w:hyperlink r:id="rId1">
       <w:r>
@@ -4848,7 +3963,96 @@
         <w:sz w:val="20"/>
         <w:szCs w:val="20"/>
       </w:rPr>
-      <w:t>C</w:t>
+      <w:t xml:space="preserve">Creative Commons 4.0 CC-BY-SA by </w:t>
+    </w:r>
+    <w:r>
+      <w:rPr>
+        <w:rFonts w:ascii="Cloister Black" w:hAnsi="Cloister Black"/>
+        <w:b w:val="false"/>
+        <w:bCs w:val="false"/>
+        <w:i w:val="false"/>
+        <w:iCs w:val="false"/>
+        <w:sz w:val="28"/>
+        <w:szCs w:val="28"/>
+      </w:rPr>
+      <w:t>BIT Mysteries</w:t>
+    </w:r>
+  </w:p>
+</w:ftr>
+</file>
+
+<file path=word/footer3.xml><?xml version="1.0" encoding="utf-8"?>
+<w:ftr xmlns:o="urn:schemas-microsoft-com:office:office" xmlns:r="http://schemas.openxmlformats.org/officeDocument/2006/relationships" xmlns:v="urn:schemas-microsoft-com:vml" xmlns:w="http://schemas.openxmlformats.org/wordprocessingml/2006/main" xmlns:w10="urn:schemas-microsoft-com:office:word" xmlns:wp="http://schemas.openxmlformats.org/drawingml/2006/wordprocessingDrawing" xmlns:pic="http://schemas.openxmlformats.org/drawingml/2006/picture" xmlns:wps="http://schemas.microsoft.com/office/word/2010/wordprocessingShape" xmlns:wpg="http://schemas.microsoft.com/office/word/2010/wordprocessingGroup" xmlns:mc="http://schemas.openxmlformats.org/markup-compatibility/2006" xmlns:wp14="http://schemas.microsoft.com/office/word/2010/wordprocessingDrawing" xmlns:w14="http://schemas.microsoft.com/office/word/2010/wordml" xmlns:w15="http://schemas.microsoft.com/office/word/2012/wordml" mc:Ignorable="w14 wp14 w15">
+  <w:p>
+    <w:pPr>
+      <w:pStyle w:val="Normal"/>
+      <w:jc w:val="center"/>
+      <w:rPr>
+        <w:rFonts w:ascii="Liberation Serif" w:hAnsi="Liberation Serif"/>
+      </w:rPr>
+    </w:pPr>
+    <w:r>
+      <w:rPr>
+        <w:rFonts w:ascii="Ruritania" w:hAnsi="Ruritania"/>
+        <w:sz w:val="28"/>
+        <w:szCs w:val="28"/>
+      </w:rPr>
+      <w:t>T</w:t>
+    </w:r>
+    <w:r>
+      <w:rPr>
+        <w:rFonts w:ascii="Cloister Black" w:hAnsi="Cloister Black"/>
+        <w:sz w:val="28"/>
+        <w:szCs w:val="28"/>
+      </w:rPr>
+      <w:t>he Hunt for the Treasure of Aural Hall</w:t>
+    </w:r>
+    <w:r>
+      <w:rPr>
+        <w:i/>
+        <w:iCs/>
+      </w:rPr>
+      <w:t xml:space="preserve"> a </w:t>
+    </w:r>
+    <w:hyperlink r:id="rId1">
+      <w:r>
+        <w:rPr>
+          <w:rStyle w:val="Hyperlink"/>
+          <w:rFonts w:ascii="Beckett" w:hAnsi="Beckett"/>
+          <w:i/>
+          <w:iCs/>
+          <w:sz w:val="28"/>
+          <w:szCs w:val="28"/>
+        </w:rPr>
+        <w:t>DepthRangers</w:t>
+      </w:r>
+    </w:hyperlink>
+    <w:r>
+      <w:rPr>
+        <w:i/>
+        <w:iCs/>
+      </w:rPr>
+      <w:t xml:space="preserve"> Solo/COOP campaign</w:t>
+    </w:r>
+  </w:p>
+  <w:p>
+    <w:pPr>
+      <w:pStyle w:val="Normal"/>
+      <w:jc w:val="center"/>
+      <w:rPr>
+        <w:rFonts w:ascii="Liberation Serif" w:hAnsi="Liberation Serif"/>
+      </w:rPr>
+    </w:pPr>
+    <w:r>
+      <w:rPr>
+        <w:b/>
+        <w:bCs/>
+        <w:i w:val="false"/>
+        <w:iCs w:val="false"/>
+        <w:sz w:val="20"/>
+        <w:szCs w:val="20"/>
+      </w:rPr>
+      <w:t xml:space="preserve">                                                                     </w:t>
     </w:r>
     <w:r>
       <w:rPr>
@@ -4859,84 +4063,7 @@
         <w:sz w:val="20"/>
         <w:szCs w:val="20"/>
       </w:rPr>
-      <w:t xml:space="preserve">reative </w:t>
-    </w:r>
-    <w:r>
-      <w:rPr>
-        <w:b w:val="false"/>
-        <w:bCs w:val="false"/>
-        <w:i w:val="false"/>
-        <w:iCs w:val="false"/>
-        <w:sz w:val="20"/>
-        <w:szCs w:val="20"/>
-      </w:rPr>
-      <w:t>C</w:t>
-    </w:r>
-    <w:r>
-      <w:rPr>
-        <w:b w:val="false"/>
-        <w:bCs w:val="false"/>
-        <w:i w:val="false"/>
-        <w:iCs w:val="false"/>
-        <w:sz w:val="20"/>
-        <w:szCs w:val="20"/>
-      </w:rPr>
-      <w:t>ommons</w:t>
-    </w:r>
-    <w:r>
-      <w:rPr>
-        <w:b w:val="false"/>
-        <w:bCs w:val="false"/>
-        <w:i w:val="false"/>
-        <w:iCs w:val="false"/>
-        <w:sz w:val="20"/>
-        <w:szCs w:val="20"/>
-      </w:rPr>
-      <w:t xml:space="preserve"> </w:t>
-    </w:r>
-    <w:r>
-      <w:rPr>
-        <w:b w:val="false"/>
-        <w:bCs w:val="false"/>
-        <w:i w:val="false"/>
-        <w:iCs w:val="false"/>
-        <w:sz w:val="20"/>
-        <w:szCs w:val="20"/>
-      </w:rPr>
-      <w:t>4.0 CC-</w:t>
-    </w:r>
-    <w:r>
-      <w:rPr>
-        <w:b w:val="false"/>
-        <w:bCs w:val="false"/>
-        <w:i w:val="false"/>
-        <w:iCs w:val="false"/>
-        <w:sz w:val="20"/>
-        <w:szCs w:val="20"/>
-      </w:rPr>
-      <w:t xml:space="preserve">BY-SA </w:t>
-    </w:r>
-    <w:r>
-      <w:rPr>
-        <w:b w:val="false"/>
-        <w:bCs w:val="false"/>
-        <w:i w:val="false"/>
-        <w:iCs w:val="false"/>
-        <w:sz w:val="20"/>
-        <w:szCs w:val="20"/>
-      </w:rPr>
-      <w:t>by</w:t>
-    </w:r>
-    <w:r>
-      <w:rPr>
-        <w:b w:val="false"/>
-        <w:bCs w:val="false"/>
-        <w:i w:val="false"/>
-        <w:iCs w:val="false"/>
-        <w:sz w:val="20"/>
-        <w:szCs w:val="20"/>
-      </w:rPr>
-      <w:t xml:space="preserve"> </w:t>
+      <w:t xml:space="preserve">Creative Commons 4.0 CC-BY-SA by </w:t>
     </w:r>
     <w:r>
       <w:rPr>
@@ -4968,7 +4095,6 @@
     </w:rPrDefault>
     <w:pPrDefault>
       <w:pPr>
-        <w:widowControl/>
         <w:suppressAutoHyphens w:val="true"/>
       </w:pPr>
     </w:pPrDefault>
@@ -4978,10 +4104,11 @@
     <w:qFormat/>
     <w:pPr>
       <w:widowControl/>
-      <w:kinsoku w:val="true"/>
-      <w:overflowPunct w:val="true"/>
-      <w:autoSpaceDE w:val="true"/>
+      <w:suppressAutoHyphens w:val="true"/>
+      <w:overflowPunct w:val="false"/>
       <w:bidi w:val="0"/>
+      <w:spacing w:before="0" w:after="0"/>
+      <w:jc w:val="start"/>
     </w:pPr>
     <w:rPr>
       <w:rFonts w:ascii="Liberation Serif" w:hAnsi="Liberation Serif" w:eastAsia="Droid Sans Fallback" w:cs="FreeSans"/>

</xml_diff>